<commit_message>
fix(reports): resolve current rainfall remaining 0 in report and dashboard telemetry
</commit_message>
<xml_diff>
--- a/outputs/reports/test_report_3hr.docx
+++ b/outputs/reports/test_report_3hr.docx
@@ -13,7 +13,7 @@
           <w:color w:val="64748B"/>
           <w:sz w:val="20"/>
         </w:rPr>
-        <w:t>SAFESURGE URBAN HYDROLOGICAL MISSION CONTROL</w:t>
+        <w:t>DRAIN OUT URBAN HYDROLOGICAL MISSION CONTROL</w:t>
         <w:br/>
       </w:r>
       <w:r>
@@ -215,7 +215,7 @@
               <w:rPr>
                 <w:sz w:val="19"/>
               </w:rPr>
-              <w:t>2026-08-30 05:11:37 UTC (Dynamic On-Demand)</w:t>
+              <w:t>2026-08-31 14:21:56 UTC (Dynamic On-Demand)</w:t>
             </w:r>
           </w:p>
         </w:tc>
@@ -280,7 +280,7 @@
     </w:p>
     <w:p>
       <w:r>
-        <w:t>At forecast lead time +0 min, current rainfall intensity is measuring 0.0 mm/h. The hydrodynamic simulation engine predicts a domain peak surface water depth of 0.0 cm (expected credible range: 0.0 – 0.0 cm) with a model confidence of 98%. The physics-guided machine learning nowcasting surrogate inferred peak depth in 0.15 ms with sub-centimeter agreement.</w:t>
+        <w:t>At forecast lead time +0 min, current rainfall intensity is measuring 2.5 mm/h. The hydrodynamic simulation engine predicts a domain peak surface water depth of 0.0 cm (expected credible range: 0.0 – 0.0 cm) with a model confidence of 98%. The physics-guided machine learning nowcasting surrogate inferred peak depth in 0.15 ms with sub-centimeter agreement.</w:t>
       </w:r>
     </w:p>
     <w:tbl>
@@ -326,7 +326,7 @@
                 <w:color w:val="0F172A"/>
                 <w:sz w:val="26"/>
               </w:rPr>
-              <w:t>0.0 mm/h</w:t>
+              <w:t>2.5 mm/h</w:t>
             </w:r>
           </w:p>
         </w:tc>

</xml_diff>